<commit_message>
feat(legal): set effective date 28.10.2026 and fix Word table widths
- LEGAL_EFFECTIVE_DATE = "28 października 2026 r." (owner decision 2026-10-28).
- Marker replacement avoids a double full stop after "r.".
- Regenerated public/legal/*.docx with the date filled in and proportional
  column widths for the tables in Polityka prywatności (§ 3) and DPA (§ 10).
- tests/legal.test.mjs: date replacement case.

Co-Authored-By: Claude Opus 5.5 <noreply@anthropic.com>
Claude-Session: https://claude.ai/code/session_01TVLzgdW7vbTRztbUdq5iwy
</commit_message>
<xml_diff>
--- a/public/legal/01_Regulamin_SkillCheck_v1.0.docx
+++ b/public/legal/01_Regulamin_SkillCheck_v1.0.docx
@@ -33,7 +33,7 @@
         <w:pStyle w:val="FirstParagraph"/>
       </w:pPr>
       <w:r>
-        <w:t xml:space="preserve">Wersja 1.0 · obowiązuje od [DATA PUBLIKACJI]</w:t>
+        <w:t xml:space="preserve">Wersja 1.0 · obowiązuje od 28 października 2026 r.</w:t>
       </w:r>
     </w:p>
     <w:bookmarkStart w:id="20" w:name="usługodawca-i-kontakt"/>
@@ -976,7 +976,7 @@
         <w:pStyle w:val="Compact"/>
       </w:pPr>
       <w:r>
-        <w:t xml:space="preserve">Regulamin obowiązuje od [DATA PUBLIKACJI].</w:t>
+        <w:t xml:space="preserve">Regulamin obowiązuje od 28 października 2026 r.</w:t>
       </w:r>
     </w:p>
     <w:bookmarkEnd w:id="33"/>

</xml_diff>

<commit_message>
docs(legal): set the effective date of legal documents v1.0 to 29.10.2026
Replace the [DATA PUBLIKACJI] marker with 29.10.2026 in the Markdown
sources, the rendered pages (LEGAL_EFFECTIVE_DATE) and the Word copies of
Regulamin, Polityka prywatności, Umowa powierzenia and "AI i nadzór
człowieka". No other legal wording changes.

Co-Authored-By: Claude Opus 5.5 <noreply@anthropic.com>
Claude-Session: https://claude.ai/code/session_01TVLzgZHR5DHEUXBmLy2SvB
</commit_message>
<xml_diff>
--- a/public/legal/01_Regulamin_SkillCheck_v1.0.docx
+++ b/public/legal/01_Regulamin_SkillCheck_v1.0.docx
@@ -33,7 +33,7 @@
         <w:pStyle w:val="FirstParagraph"/>
       </w:pPr>
       <w:r>
-        <w:t xml:space="preserve">Wersja 1.0 · obowiązuje od 28 października 2026 r.</w:t>
+        <w:t xml:space="preserve">Wersja 1.0 · obowiązuje od 29.10.2026</w:t>
       </w:r>
     </w:p>
     <w:bookmarkStart w:id="20" w:name="usługodawca-i-kontakt"/>
@@ -976,7 +976,7 @@
         <w:pStyle w:val="Compact"/>
       </w:pPr>
       <w:r>
-        <w:t xml:space="preserve">Regulamin obowiązuje od 28 października 2026 r.</w:t>
+        <w:t xml:space="preserve">Regulamin obowiązuje od 29.10.2026.</w:t>
       </w:r>
     </w:p>
     <w:bookmarkEnd w:id="33"/>

</xml_diff>